<commit_message>
Create instantiate and instanatiate with RB tests
Created two scenes, one for testing instantiating objects and another for testing instantiating objects with rigid bodies attached. We also write a standard OOP approach to the instantiating with rigid bodies test to create a comparison in performance.
</commit_message>
<xml_diff>
--- a/Project Documentation/ECS Implemented in Unity.docx
+++ b/Project Documentation/ECS Implemented in Unity.docx
@@ -160,7 +160,23 @@
         <w:t xml:space="preserve">Unity Entities: </w:t>
       </w:r>
       <w:r>
-        <w:t>replaces GameObject and MonoBehaviour with an entity system of unmanaged memory</w:t>
+        <w:t xml:space="preserve">replaces </w:t>
+      </w:r>
+      <w:proofErr w:type="spellStart"/>
+      <w:r>
+        <w:t>GameObject</w:t>
+      </w:r>
+      <w:proofErr w:type="spellEnd"/>
+      <w:r>
+        <w:t xml:space="preserve"> and </w:t>
+      </w:r>
+      <w:proofErr w:type="spellStart"/>
+      <w:r>
+        <w:t>MonoBehaviour</w:t>
+      </w:r>
+      <w:proofErr w:type="spellEnd"/>
+      <w:r>
+        <w:t xml:space="preserve"> with an entity system of unmanaged memory</w:t>
       </w:r>
     </w:p>
     <w:p>
@@ -214,8 +230,17 @@
           <w:b/>
           <w:bCs/>
         </w:rPr>
-        <w:t>LLVM compilation:</w:t>
-      </w:r>
+        <w:t xml:space="preserve">LLVM </w:t>
+      </w:r>
+      <w:proofErr w:type="gramStart"/>
+      <w:r>
+        <w:rPr>
+          <w:b/>
+          <w:bCs/>
+        </w:rPr>
+        <w:t>compilation:</w:t>
+      </w:r>
+      <w:proofErr w:type="gramEnd"/>
       <w:r>
         <w:t xml:space="preserve"> converts high level language code into an intermediate representation (LLVM IR)</w:t>
       </w:r>
@@ -243,15 +268,32 @@
           <w:numId w:val="1"/>
         </w:numPr>
       </w:pPr>
+      <w:proofErr w:type="spellStart"/>
       <w:r>
         <w:rPr>
           <w:b/>
           <w:bCs/>
         </w:rPr>
-        <w:t xml:space="preserve">Unity.Physics: </w:t>
-      </w:r>
-      <w:r>
-        <w:t>A burst compiled physics engine which can simulate thousands of rigidbodies simultaneously</w:t>
+        <w:t>Unity.Physics</w:t>
+      </w:r>
+      <w:proofErr w:type="spellEnd"/>
+      <w:r>
+        <w:rPr>
+          <w:b/>
+          <w:bCs/>
+        </w:rPr>
+        <w:t xml:space="preserve">: </w:t>
+      </w:r>
+      <w:r>
+        <w:t xml:space="preserve">A burst compiled physics engine which can simulate thousands of </w:t>
+      </w:r>
+      <w:proofErr w:type="spellStart"/>
+      <w:r>
+        <w:t>rigidbodies</w:t>
+      </w:r>
+      <w:proofErr w:type="spellEnd"/>
+      <w:r>
+        <w:t xml:space="preserve"> simultaneously</w:t>
       </w:r>
       <w:r>
         <w:t xml:space="preserve"> (debris simulation)</w:t>
@@ -293,16 +335,50 @@
           <w:numId w:val="1"/>
         </w:numPr>
       </w:pPr>
+      <w:proofErr w:type="spellStart"/>
       <w:r>
         <w:rPr>
           <w:b/>
           <w:bCs/>
         </w:rPr>
-        <w:t>Netcode for entities:</w:t>
-      </w:r>
-      <w:r>
-        <w:t xml:space="preserve"> The framework for making multiplayer applications on top of ECS, uses tick based snapshots and comes with lag compensation rollback as part of design</w:t>
-      </w:r>
+        <w:t>Netcode</w:t>
+      </w:r>
+      <w:proofErr w:type="spellEnd"/>
+      <w:r>
+        <w:rPr>
+          <w:b/>
+          <w:bCs/>
+        </w:rPr>
+        <w:t xml:space="preserve"> for entities:</w:t>
+      </w:r>
+      <w:r>
+        <w:t xml:space="preserve"> The framework for making multiplayer applications on top of ECS, uses </w:t>
+      </w:r>
+      <w:proofErr w:type="gramStart"/>
+      <w:r>
+        <w:t>tick based</w:t>
+      </w:r>
+      <w:proofErr w:type="gramEnd"/>
+      <w:r>
+        <w:t xml:space="preserve"> snapshots and comes with lag compensation rollback as part of design</w:t>
+      </w:r>
+    </w:p>
+    <w:p>
+      <w:pPr>
+        <w:pStyle w:val="Heading2"/>
+      </w:pPr>
+      <w:r>
+        <w:t>ECS in memory</w:t>
+      </w:r>
+    </w:p>
+    <w:p>
+      <w:pPr>
+        <w:pStyle w:val="ListParagraph"/>
+        <w:numPr>
+          <w:ilvl w:val="0"/>
+          <w:numId w:val="1"/>
+        </w:numPr>
+      </w:pPr>
     </w:p>
     <w:sectPr>
       <w:pgSz w:w="11906" w:h="16838"/>
@@ -1691,11 +1767,12 @@
 </file>
 
 <file path=customXml/item1.xml><?xml version="1.0" encoding="utf-8"?>
-<p:properties xmlns:p="http://schemas.microsoft.com/office/2006/metadata/properties" xmlns:xsi="http://www.w3.org/2001/XMLSchema-instance" xmlns:pc="http://schemas.microsoft.com/office/infopath/2007/PartnerControls">
-  <documentManagement>
-    <_activity xmlns="a982576a-fadc-488c-bed3-b6207ce485d6" xsi:nil="true"/>
-  </documentManagement>
-</p:properties>
+<?mso-contentType ?>
+<FormTemplates xmlns="http://schemas.microsoft.com/sharepoint/v3/contenttype/forms">
+  <Display>DocumentLibraryForm</Display>
+  <Edit>DocumentLibraryForm</Edit>
+  <New>DocumentLibraryForm</New>
+</FormTemplates>
 </file>
 
 <file path=customXml/item2.xml><?xml version="1.0" encoding="utf-8"?>
@@ -1932,20 +2009,17 @@
 </file>
 
 <file path=customXml/item3.xml><?xml version="1.0" encoding="utf-8"?>
-<?mso-contentType ?>
-<FormTemplates xmlns="http://schemas.microsoft.com/sharepoint/v3/contenttype/forms">
-  <Display>DocumentLibraryForm</Display>
-  <Edit>DocumentLibraryForm</Edit>
-  <New>DocumentLibraryForm</New>
-</FormTemplates>
+<p:properties xmlns:p="http://schemas.microsoft.com/office/2006/metadata/properties" xmlns:xsi="http://www.w3.org/2001/XMLSchema-instance" xmlns:pc="http://schemas.microsoft.com/office/infopath/2007/PartnerControls">
+  <documentManagement>
+    <_activity xmlns="a982576a-fadc-488c-bed3-b6207ce485d6" xsi:nil="true"/>
+  </documentManagement>
+</p:properties>
 </file>
 
 <file path=customXml/itemProps1.xml><?xml version="1.0" encoding="utf-8"?>
-<ds:datastoreItem xmlns:ds="http://schemas.openxmlformats.org/officeDocument/2006/customXml" ds:itemID="{1B91A188-83CA-4EB9-AF99-2BFFC12AF983}">
+<ds:datastoreItem xmlns:ds="http://schemas.openxmlformats.org/officeDocument/2006/customXml" ds:itemID="{49936669-CA20-46BB-B7D4-FA0EF342DC55}">
   <ds:schemaRefs>
-    <ds:schemaRef ds:uri="http://schemas.microsoft.com/office/2006/metadata/properties"/>
-    <ds:schemaRef ds:uri="http://schemas.microsoft.com/office/infopath/2007/PartnerControls"/>
-    <ds:schemaRef ds:uri="a982576a-fadc-488c-bed3-b6207ce485d6"/>
+    <ds:schemaRef ds:uri="http://schemas.microsoft.com/sharepoint/v3/contenttype/forms"/>
   </ds:schemaRefs>
 </ds:datastoreItem>
 </file>
@@ -1970,9 +2044,11 @@
 </file>
 
 <file path=customXml/itemProps3.xml><?xml version="1.0" encoding="utf-8"?>
-<ds:datastoreItem xmlns:ds="http://schemas.openxmlformats.org/officeDocument/2006/customXml" ds:itemID="{49936669-CA20-46BB-B7D4-FA0EF342DC55}">
+<ds:datastoreItem xmlns:ds="http://schemas.openxmlformats.org/officeDocument/2006/customXml" ds:itemID="{1B91A188-83CA-4EB9-AF99-2BFFC12AF983}">
   <ds:schemaRefs>
-    <ds:schemaRef ds:uri="http://schemas.microsoft.com/sharepoint/v3/contenttype/forms"/>
+    <ds:schemaRef ds:uri="http://schemas.microsoft.com/office/2006/metadata/properties"/>
+    <ds:schemaRef ds:uri="http://schemas.microsoft.com/office/infopath/2007/PartnerControls"/>
+    <ds:schemaRef ds:uri="a982576a-fadc-488c-bed3-b6207ce485d6"/>
   </ds:schemaRefs>
 </ds:datastoreItem>
 </file>
</xml_diff>